<commit_message>
Batch16.8 [tables]: real-data Tables S1, S2, S4, S5, S7 (DiD, pre-trends, WCB, jackknife, placebo)
</commit_message>
<xml_diff>
--- a/manuscript/supplement/Table_S7_placebo.docx
+++ b/manuscript/supplement/Table_S7_placebo.docx
@@ -229,7 +229,7 @@
                 <w:rFonts w:ascii="Arial" w:hAnsi="Arial"/>
                 <w:sz w:val="18"/>
               </w:rPr>
-              <w:t>+5.66</w:t>
+              <w:t>+15.29</w:t>
             </w:r>
           </w:p>
         </w:tc>
@@ -243,7 +243,7 @@
                 <w:rFonts w:ascii="Arial" w:hAnsi="Arial"/>
                 <w:sz w:val="18"/>
               </w:rPr>
-              <w:t>-0.14</w:t>
+              <w:t>-1.14</w:t>
             </w:r>
           </w:p>
         </w:tc>
@@ -257,7 +257,7 @@
                 <w:rFonts w:ascii="Arial" w:hAnsi="Arial"/>
                 <w:sz w:val="18"/>
               </w:rPr>
-              <w:t>-3.74</w:t>
+              <w:t>-32.50</w:t>
             </w:r>
           </w:p>
         </w:tc>
@@ -271,7 +271,7 @@
                 <w:rFonts w:ascii="Arial" w:hAnsi="Arial"/>
                 <w:sz w:val="18"/>
               </w:rPr>
-              <w:t>+3.10</w:t>
+              <w:t>+28.76</w:t>
             </w:r>
           </w:p>
         </w:tc>
@@ -285,7 +285,7 @@
                 <w:rFonts w:ascii="Arial" w:hAnsi="Arial"/>
                 <w:sz w:val="18"/>
               </w:rPr>
-              <w:t>+4.17</w:t>
+              <w:t>+43.45</w:t>
             </w:r>
           </w:p>
         </w:tc>
@@ -299,7 +299,7 @@
                 <w:rFonts w:ascii="Arial" w:hAnsi="Arial"/>
                 <w:sz w:val="18"/>
               </w:rPr>
-              <w:t>0</w:t>
+              <w:t>27</w:t>
             </w:r>
           </w:p>
         </w:tc>
@@ -313,7 +313,7 @@
                 <w:rFonts w:ascii="Arial" w:hAnsi="Arial"/>
                 <w:sz w:val="18"/>
               </w:rPr>
-              <w:t>0.0179</w:t>
+              <w:t>0.5000</w:t>
             </w:r>
           </w:p>
         </w:tc>
@@ -327,7 +327,7 @@
                 <w:rFonts w:ascii="Arial" w:hAnsi="Arial"/>
                 <w:sz w:val="18"/>
               </w:rPr>
-              <w:t>passes</w:t>
+              <w:t>fails</w:t>
             </w:r>
           </w:p>
         </w:tc>
@@ -371,7 +371,7 @@
                 <w:rFonts w:ascii="Arial" w:hAnsi="Arial"/>
                 <w:sz w:val="18"/>
               </w:rPr>
-              <w:t>+4.35</w:t>
+              <w:t>-3.59</w:t>
             </w:r>
           </w:p>
         </w:tc>
@@ -385,7 +385,7 @@
                 <w:rFonts w:ascii="Arial" w:hAnsi="Arial"/>
                 <w:sz w:val="18"/>
               </w:rPr>
-              <w:t>-0.27</w:t>
+              <w:t>-0.28</w:t>
             </w:r>
           </w:p>
         </w:tc>
@@ -399,7 +399,7 @@
                 <w:rFonts w:ascii="Arial" w:hAnsi="Arial"/>
                 <w:sz w:val="18"/>
               </w:rPr>
-              <w:t>-2.82</w:t>
+              <w:t>-4.80</w:t>
             </w:r>
           </w:p>
         </w:tc>
@@ -413,7 +413,7 @@
                 <w:rFonts w:ascii="Arial" w:hAnsi="Arial"/>
                 <w:sz w:val="18"/>
               </w:rPr>
-              <w:t>+2.28</w:t>
+              <w:t>+4.58</w:t>
             </w:r>
           </w:p>
         </w:tc>
@@ -427,7 +427,7 @@
                 <w:rFonts w:ascii="Arial" w:hAnsi="Arial"/>
                 <w:sz w:val="18"/>
               </w:rPr>
-              <w:t>+3.19</w:t>
+              <w:t>+6.12</w:t>
             </w:r>
           </w:p>
         </w:tc>
@@ -441,7 +441,7 @@
                 <w:rFonts w:ascii="Arial" w:hAnsi="Arial"/>
                 <w:sz w:val="18"/>
               </w:rPr>
-              <w:t>0</w:t>
+              <w:t>15</w:t>
             </w:r>
           </w:p>
         </w:tc>
@@ -455,7 +455,7 @@
                 <w:rFonts w:ascii="Arial" w:hAnsi="Arial"/>
                 <w:sz w:val="18"/>
               </w:rPr>
-              <w:t>0.0179</w:t>
+              <w:t>0.2857</w:t>
             </w:r>
           </w:p>
         </w:tc>
@@ -469,7 +469,7 @@
                 <w:rFonts w:ascii="Arial" w:hAnsi="Arial"/>
                 <w:sz w:val="18"/>
               </w:rPr>
-              <w:t>passes</w:t>
+              <w:t>fails</w:t>
             </w:r>
           </w:p>
         </w:tc>
@@ -513,7 +513,7 @@
                 <w:rFonts w:ascii="Arial" w:hAnsi="Arial"/>
                 <w:sz w:val="18"/>
               </w:rPr>
-              <w:t>+1.88</w:t>
+              <w:t>+nan</w:t>
             </w:r>
           </w:p>
         </w:tc>
@@ -527,7 +527,7 @@
                 <w:rFonts w:ascii="Arial" w:hAnsi="Arial"/>
                 <w:sz w:val="18"/>
               </w:rPr>
-              <w:t>+0.02</w:t>
+              <w:t>+nan</w:t>
             </w:r>
           </w:p>
         </w:tc>
@@ -541,7 +541,7 @@
                 <w:rFonts w:ascii="Arial" w:hAnsi="Arial"/>
                 <w:sz w:val="18"/>
               </w:rPr>
-              <w:t>-1.45</w:t>
+              <w:t>+nan</w:t>
             </w:r>
           </w:p>
         </w:tc>
@@ -555,7 +555,7 @@
                 <w:rFonts w:ascii="Arial" w:hAnsi="Arial"/>
                 <w:sz w:val="18"/>
               </w:rPr>
-              <w:t>+1.34</w:t>
+              <w:t>+nan</w:t>
             </w:r>
           </w:p>
         </w:tc>
@@ -569,291 +569,7 @@
                 <w:rFonts w:ascii="Arial" w:hAnsi="Arial"/>
                 <w:sz w:val="18"/>
               </w:rPr>
-              <w:t>+2.03</w:t>
-            </w:r>
-          </w:p>
-        </w:tc>
-        <w:tc>
-          <w:tcPr>
-            <w:tcW w:type="dxa" w:w="864"/>
-          </w:tcPr>
-          <w:p>
-            <w:r>
-              <w:rPr>
-                <w:rFonts w:ascii="Arial" w:hAnsi="Arial"/>
-                <w:sz w:val="18"/>
-              </w:rPr>
-              <w:t>1</w:t>
-            </w:r>
-          </w:p>
-        </w:tc>
-        <w:tc>
-          <w:tcPr>
-            <w:tcW w:type="dxa" w:w="864"/>
-          </w:tcPr>
-          <w:p>
-            <w:r>
-              <w:rPr>
-                <w:rFonts w:ascii="Arial" w:hAnsi="Arial"/>
-                <w:sz w:val="18"/>
-              </w:rPr>
-              <w:t>0.0357</w:t>
-            </w:r>
-          </w:p>
-        </w:tc>
-        <w:tc>
-          <w:tcPr>
-            <w:tcW w:type="dxa" w:w="864"/>
-          </w:tcPr>
-          <w:p>
-            <w:r>
-              <w:rPr>
-                <w:rFonts w:ascii="Arial" w:hAnsi="Arial"/>
-                <w:sz w:val="18"/>
-              </w:rPr>
-              <w:t>passes</w:t>
-            </w:r>
-          </w:p>
-        </w:tc>
-      </w:tr>
-      <w:tr>
-        <w:tc>
-          <w:tcPr>
-            <w:tcW w:type="dxa" w:w="864"/>
-          </w:tcPr>
-          <w:p>
-            <w:r>
-              <w:rPr>
-                <w:rFonts w:ascii="Arial" w:hAnsi="Arial"/>
-                <w:sz w:val="18"/>
-              </w:rPr>
-              <w:t>corrected</w:t>
-            </w:r>
-          </w:p>
-        </w:tc>
-        <w:tc>
-          <w:tcPr>
-            <w:tcW w:type="dxa" w:w="864"/>
-          </w:tcPr>
-          <w:p>
-            <w:r>
-              <w:rPr>
-                <w:rFonts w:ascii="Arial" w:hAnsi="Arial"/>
-                <w:sz w:val="18"/>
-              </w:rPr>
-              <w:t>SOS</w:t>
-            </w:r>
-          </w:p>
-        </w:tc>
-        <w:tc>
-          <w:tcPr>
-            <w:tcW w:type="dxa" w:w="864"/>
-          </w:tcPr>
-          <w:p>
-            <w:r>
-              <w:rPr>
-                <w:rFonts w:ascii="Arial" w:hAnsi="Arial"/>
-                <w:sz w:val="18"/>
-              </w:rPr>
-              <w:t>+1.96</w:t>
-            </w:r>
-          </w:p>
-        </w:tc>
-        <w:tc>
-          <w:tcPr>
-            <w:tcW w:type="dxa" w:w="864"/>
-          </w:tcPr>
-          <w:p>
-            <w:r>
-              <w:rPr>
-                <w:rFonts w:ascii="Arial" w:hAnsi="Arial"/>
-                <w:sz w:val="18"/>
-              </w:rPr>
-              <w:t>-0.04</w:t>
-            </w:r>
-          </w:p>
-        </w:tc>
-        <w:tc>
-          <w:tcPr>
-            <w:tcW w:type="dxa" w:w="864"/>
-          </w:tcPr>
-          <w:p>
-            <w:r>
-              <w:rPr>
-                <w:rFonts w:ascii="Arial" w:hAnsi="Arial"/>
-                <w:sz w:val="18"/>
-              </w:rPr>
-              <w:t>-1.57</w:t>
-            </w:r>
-          </w:p>
-        </w:tc>
-        <w:tc>
-          <w:tcPr>
-            <w:tcW w:type="dxa" w:w="864"/>
-          </w:tcPr>
-          <w:p>
-            <w:r>
-              <w:rPr>
-                <w:rFonts w:ascii="Arial" w:hAnsi="Arial"/>
-                <w:sz w:val="18"/>
-              </w:rPr>
-              <w:t>+1.32</w:t>
-            </w:r>
-          </w:p>
-        </w:tc>
-        <w:tc>
-          <w:tcPr>
-            <w:tcW w:type="dxa" w:w="864"/>
-          </w:tcPr>
-          <w:p>
-            <w:r>
-              <w:rPr>
-                <w:rFonts w:ascii="Arial" w:hAnsi="Arial"/>
-                <w:sz w:val="18"/>
-              </w:rPr>
-              <w:t>+2.15</w:t>
-            </w:r>
-          </w:p>
-        </w:tc>
-        <w:tc>
-          <w:tcPr>
-            <w:tcW w:type="dxa" w:w="864"/>
-          </w:tcPr>
-          <w:p>
-            <w:r>
-              <w:rPr>
-                <w:rFonts w:ascii="Arial" w:hAnsi="Arial"/>
-                <w:sz w:val="18"/>
-              </w:rPr>
-              <w:t>2</w:t>
-            </w:r>
-          </w:p>
-        </w:tc>
-        <w:tc>
-          <w:tcPr>
-            <w:tcW w:type="dxa" w:w="864"/>
-          </w:tcPr>
-          <w:p>
-            <w:r>
-              <w:rPr>
-                <w:rFonts w:ascii="Arial" w:hAnsi="Arial"/>
-                <w:sz w:val="18"/>
-              </w:rPr>
-              <w:t>0.0536</w:t>
-            </w:r>
-          </w:p>
-        </w:tc>
-        <w:tc>
-          <w:tcPr>
-            <w:tcW w:type="dxa" w:w="864"/>
-          </w:tcPr>
-          <w:p>
-            <w:r>
-              <w:rPr>
-                <w:rFonts w:ascii="Arial" w:hAnsi="Arial"/>
-                <w:sz w:val="18"/>
-              </w:rPr>
-              <w:t>passes</w:t>
-            </w:r>
-          </w:p>
-        </w:tc>
-      </w:tr>
-      <w:tr>
-        <w:tc>
-          <w:tcPr>
-            <w:tcW w:type="dxa" w:w="864"/>
-          </w:tcPr>
-          <w:p>
-            <w:r>
-              <w:rPr>
-                <w:rFonts w:ascii="Arial" w:hAnsi="Arial"/>
-                <w:sz w:val="18"/>
-              </w:rPr>
-              <w:t>corrected</w:t>
-            </w:r>
-          </w:p>
-        </w:tc>
-        <w:tc>
-          <w:tcPr>
-            <w:tcW w:type="dxa" w:w="864"/>
-          </w:tcPr>
-          <w:p>
-            <w:r>
-              <w:rPr>
-                <w:rFonts w:ascii="Arial" w:hAnsi="Arial"/>
-                <w:sz w:val="18"/>
-              </w:rPr>
-              <w:t>POS</w:t>
-            </w:r>
-          </w:p>
-        </w:tc>
-        <w:tc>
-          <w:tcPr>
-            <w:tcW w:type="dxa" w:w="864"/>
-          </w:tcPr>
-          <w:p>
-            <w:r>
-              <w:rPr>
-                <w:rFonts w:ascii="Arial" w:hAnsi="Arial"/>
-                <w:sz w:val="18"/>
-              </w:rPr>
-              <w:t>+2.10</w:t>
-            </w:r>
-          </w:p>
-        </w:tc>
-        <w:tc>
-          <w:tcPr>
-            <w:tcW w:type="dxa" w:w="864"/>
-          </w:tcPr>
-          <w:p>
-            <w:r>
-              <w:rPr>
-                <w:rFonts w:ascii="Arial" w:hAnsi="Arial"/>
-                <w:sz w:val="18"/>
-              </w:rPr>
-              <w:t>+0.01</w:t>
-            </w:r>
-          </w:p>
-        </w:tc>
-        <w:tc>
-          <w:tcPr>
-            <w:tcW w:type="dxa" w:w="864"/>
-          </w:tcPr>
-          <w:p>
-            <w:r>
-              <w:rPr>
-                <w:rFonts w:ascii="Arial" w:hAnsi="Arial"/>
-                <w:sz w:val="18"/>
-              </w:rPr>
-              <w:t>-1.57</w:t>
-            </w:r>
-          </w:p>
-        </w:tc>
-        <w:tc>
-          <w:tcPr>
-            <w:tcW w:type="dxa" w:w="864"/>
-          </w:tcPr>
-          <w:p>
-            <w:r>
-              <w:rPr>
-                <w:rFonts w:ascii="Arial" w:hAnsi="Arial"/>
-                <w:sz w:val="18"/>
-              </w:rPr>
-              <w:t>+1.39</w:t>
-            </w:r>
-          </w:p>
-        </w:tc>
-        <w:tc>
-          <w:tcPr>
-            <w:tcW w:type="dxa" w:w="864"/>
-          </w:tcPr>
-          <w:p>
-            <w:r>
-              <w:rPr>
-                <w:rFonts w:ascii="Arial" w:hAnsi="Arial"/>
-                <w:sz w:val="18"/>
-              </w:rPr>
-              <w:t>+1.75</w:t>
+              <w:t>+nan</w:t>
             </w:r>
           </w:p>
         </w:tc>
@@ -925,6 +641,290 @@
                 <w:rFonts w:ascii="Arial" w:hAnsi="Arial"/>
                 <w:sz w:val="18"/>
               </w:rPr>
+              <w:t>SOS</w:t>
+            </w:r>
+          </w:p>
+        </w:tc>
+        <w:tc>
+          <w:tcPr>
+            <w:tcW w:type="dxa" w:w="864"/>
+          </w:tcPr>
+          <w:p>
+            <w:r>
+              <w:rPr>
+                <w:rFonts w:ascii="Arial" w:hAnsi="Arial"/>
+                <w:sz w:val="18"/>
+              </w:rPr>
+              <w:t>+15.29</w:t>
+            </w:r>
+          </w:p>
+        </w:tc>
+        <w:tc>
+          <w:tcPr>
+            <w:tcW w:type="dxa" w:w="864"/>
+          </w:tcPr>
+          <w:p>
+            <w:r>
+              <w:rPr>
+                <w:rFonts w:ascii="Arial" w:hAnsi="Arial"/>
+                <w:sz w:val="18"/>
+              </w:rPr>
+              <w:t>-1.14</w:t>
+            </w:r>
+          </w:p>
+        </w:tc>
+        <w:tc>
+          <w:tcPr>
+            <w:tcW w:type="dxa" w:w="864"/>
+          </w:tcPr>
+          <w:p>
+            <w:r>
+              <w:rPr>
+                <w:rFonts w:ascii="Arial" w:hAnsi="Arial"/>
+                <w:sz w:val="18"/>
+              </w:rPr>
+              <w:t>-32.50</w:t>
+            </w:r>
+          </w:p>
+        </w:tc>
+        <w:tc>
+          <w:tcPr>
+            <w:tcW w:type="dxa" w:w="864"/>
+          </w:tcPr>
+          <w:p>
+            <w:r>
+              <w:rPr>
+                <w:rFonts w:ascii="Arial" w:hAnsi="Arial"/>
+                <w:sz w:val="18"/>
+              </w:rPr>
+              <w:t>+28.76</w:t>
+            </w:r>
+          </w:p>
+        </w:tc>
+        <w:tc>
+          <w:tcPr>
+            <w:tcW w:type="dxa" w:w="864"/>
+          </w:tcPr>
+          <w:p>
+            <w:r>
+              <w:rPr>
+                <w:rFonts w:ascii="Arial" w:hAnsi="Arial"/>
+                <w:sz w:val="18"/>
+              </w:rPr>
+              <w:t>+43.45</w:t>
+            </w:r>
+          </w:p>
+        </w:tc>
+        <w:tc>
+          <w:tcPr>
+            <w:tcW w:type="dxa" w:w="864"/>
+          </w:tcPr>
+          <w:p>
+            <w:r>
+              <w:rPr>
+                <w:rFonts w:ascii="Arial" w:hAnsi="Arial"/>
+                <w:sz w:val="18"/>
+              </w:rPr>
+              <w:t>27</w:t>
+            </w:r>
+          </w:p>
+        </w:tc>
+        <w:tc>
+          <w:tcPr>
+            <w:tcW w:type="dxa" w:w="864"/>
+          </w:tcPr>
+          <w:p>
+            <w:r>
+              <w:rPr>
+                <w:rFonts w:ascii="Arial" w:hAnsi="Arial"/>
+                <w:sz w:val="18"/>
+              </w:rPr>
+              <w:t>0.5000</w:t>
+            </w:r>
+          </w:p>
+        </w:tc>
+        <w:tc>
+          <w:tcPr>
+            <w:tcW w:type="dxa" w:w="864"/>
+          </w:tcPr>
+          <w:p>
+            <w:r>
+              <w:rPr>
+                <w:rFonts w:ascii="Arial" w:hAnsi="Arial"/>
+                <w:sz w:val="18"/>
+              </w:rPr>
+              <w:t>fails</w:t>
+            </w:r>
+          </w:p>
+        </w:tc>
+      </w:tr>
+      <w:tr>
+        <w:tc>
+          <w:tcPr>
+            <w:tcW w:type="dxa" w:w="864"/>
+          </w:tcPr>
+          <w:p>
+            <w:r>
+              <w:rPr>
+                <w:rFonts w:ascii="Arial" w:hAnsi="Arial"/>
+                <w:sz w:val="18"/>
+              </w:rPr>
+              <w:t>corrected</w:t>
+            </w:r>
+          </w:p>
+        </w:tc>
+        <w:tc>
+          <w:tcPr>
+            <w:tcW w:type="dxa" w:w="864"/>
+          </w:tcPr>
+          <w:p>
+            <w:r>
+              <w:rPr>
+                <w:rFonts w:ascii="Arial" w:hAnsi="Arial"/>
+                <w:sz w:val="18"/>
+              </w:rPr>
+              <w:t>POS</w:t>
+            </w:r>
+          </w:p>
+        </w:tc>
+        <w:tc>
+          <w:tcPr>
+            <w:tcW w:type="dxa" w:w="864"/>
+          </w:tcPr>
+          <w:p>
+            <w:r>
+              <w:rPr>
+                <w:rFonts w:ascii="Arial" w:hAnsi="Arial"/>
+                <w:sz w:val="18"/>
+              </w:rPr>
+              <w:t>-3.59</w:t>
+            </w:r>
+          </w:p>
+        </w:tc>
+        <w:tc>
+          <w:tcPr>
+            <w:tcW w:type="dxa" w:w="864"/>
+          </w:tcPr>
+          <w:p>
+            <w:r>
+              <w:rPr>
+                <w:rFonts w:ascii="Arial" w:hAnsi="Arial"/>
+                <w:sz w:val="18"/>
+              </w:rPr>
+              <w:t>-0.28</w:t>
+            </w:r>
+          </w:p>
+        </w:tc>
+        <w:tc>
+          <w:tcPr>
+            <w:tcW w:type="dxa" w:w="864"/>
+          </w:tcPr>
+          <w:p>
+            <w:r>
+              <w:rPr>
+                <w:rFonts w:ascii="Arial" w:hAnsi="Arial"/>
+                <w:sz w:val="18"/>
+              </w:rPr>
+              <w:t>-4.80</w:t>
+            </w:r>
+          </w:p>
+        </w:tc>
+        <w:tc>
+          <w:tcPr>
+            <w:tcW w:type="dxa" w:w="864"/>
+          </w:tcPr>
+          <w:p>
+            <w:r>
+              <w:rPr>
+                <w:rFonts w:ascii="Arial" w:hAnsi="Arial"/>
+                <w:sz w:val="18"/>
+              </w:rPr>
+              <w:t>+4.58</w:t>
+            </w:r>
+          </w:p>
+        </w:tc>
+        <w:tc>
+          <w:tcPr>
+            <w:tcW w:type="dxa" w:w="864"/>
+          </w:tcPr>
+          <w:p>
+            <w:r>
+              <w:rPr>
+                <w:rFonts w:ascii="Arial" w:hAnsi="Arial"/>
+                <w:sz w:val="18"/>
+              </w:rPr>
+              <w:t>+6.12</w:t>
+            </w:r>
+          </w:p>
+        </w:tc>
+        <w:tc>
+          <w:tcPr>
+            <w:tcW w:type="dxa" w:w="864"/>
+          </w:tcPr>
+          <w:p>
+            <w:r>
+              <w:rPr>
+                <w:rFonts w:ascii="Arial" w:hAnsi="Arial"/>
+                <w:sz w:val="18"/>
+              </w:rPr>
+              <w:t>15</w:t>
+            </w:r>
+          </w:p>
+        </w:tc>
+        <w:tc>
+          <w:tcPr>
+            <w:tcW w:type="dxa" w:w="864"/>
+          </w:tcPr>
+          <w:p>
+            <w:r>
+              <w:rPr>
+                <w:rFonts w:ascii="Arial" w:hAnsi="Arial"/>
+                <w:sz w:val="18"/>
+              </w:rPr>
+              <w:t>0.2857</w:t>
+            </w:r>
+          </w:p>
+        </w:tc>
+        <w:tc>
+          <w:tcPr>
+            <w:tcW w:type="dxa" w:w="864"/>
+          </w:tcPr>
+          <w:p>
+            <w:r>
+              <w:rPr>
+                <w:rFonts w:ascii="Arial" w:hAnsi="Arial"/>
+                <w:sz w:val="18"/>
+              </w:rPr>
+              <w:t>fails</w:t>
+            </w:r>
+          </w:p>
+        </w:tc>
+      </w:tr>
+      <w:tr>
+        <w:tc>
+          <w:tcPr>
+            <w:tcW w:type="dxa" w:w="864"/>
+          </w:tcPr>
+          <w:p>
+            <w:r>
+              <w:rPr>
+                <w:rFonts w:ascii="Arial" w:hAnsi="Arial"/>
+                <w:sz w:val="18"/>
+              </w:rPr>
+              <w:t>corrected</w:t>
+            </w:r>
+          </w:p>
+        </w:tc>
+        <w:tc>
+          <w:tcPr>
+            <w:tcW w:type="dxa" w:w="864"/>
+          </w:tcPr>
+          <w:p>
+            <w:r>
+              <w:rPr>
+                <w:rFonts w:ascii="Arial" w:hAnsi="Arial"/>
+                <w:sz w:val="18"/>
+              </w:rPr>
               <w:t>EOS</w:t>
             </w:r>
           </w:p>
@@ -939,7 +939,7 @@
                 <w:rFonts w:ascii="Arial" w:hAnsi="Arial"/>
                 <w:sz w:val="18"/>
               </w:rPr>
-              <w:t>+0.56</w:t>
+              <w:t>+nan</w:t>
             </w:r>
           </w:p>
         </w:tc>
@@ -953,7 +953,7 @@
                 <w:rFonts w:ascii="Arial" w:hAnsi="Arial"/>
                 <w:sz w:val="18"/>
               </w:rPr>
-              <w:t>-0.01</w:t>
+              <w:t>+nan</w:t>
             </w:r>
           </w:p>
         </w:tc>
@@ -967,7 +967,7 @@
                 <w:rFonts w:ascii="Arial" w:hAnsi="Arial"/>
                 <w:sz w:val="18"/>
               </w:rPr>
-              <w:t>-0.73</w:t>
+              <w:t>+nan</w:t>
             </w:r>
           </w:p>
         </w:tc>
@@ -981,7 +981,7 @@
                 <w:rFonts w:ascii="Arial" w:hAnsi="Arial"/>
                 <w:sz w:val="18"/>
               </w:rPr>
-              <w:t>+0.75</w:t>
+              <w:t>+nan</w:t>
             </w:r>
           </w:p>
         </w:tc>
@@ -995,7 +995,7 @@
                 <w:rFonts w:ascii="Arial" w:hAnsi="Arial"/>
                 <w:sz w:val="18"/>
               </w:rPr>
-              <w:t>+1.05</w:t>
+              <w:t>+nan</w:t>
             </w:r>
           </w:p>
         </w:tc>
@@ -1009,7 +1009,7 @@
                 <w:rFonts w:ascii="Arial" w:hAnsi="Arial"/>
                 <w:sz w:val="18"/>
               </w:rPr>
-              <w:t>14</w:t>
+              <w:t>0</w:t>
             </w:r>
           </w:p>
         </w:tc>
@@ -1023,7 +1023,7 @@
                 <w:rFonts w:ascii="Arial" w:hAnsi="Arial"/>
                 <w:sz w:val="18"/>
               </w:rPr>
-              <w:t>0.2679</w:t>
+              <w:t>0.0179</w:t>
             </w:r>
           </w:p>
         </w:tc>
@@ -1037,7 +1037,7 @@
                 <w:rFonts w:ascii="Arial" w:hAnsi="Arial"/>
                 <w:sz w:val="18"/>
               </w:rPr>
-              <w:t>fails</w:t>
+              <w:t>passes</w:t>
             </w:r>
           </w:p>
         </w:tc>
@@ -1194,7 +1194,7 @@
                 <w:rFonts w:ascii="Arial" w:hAnsi="Arial"/>
                 <w:sz w:val="18"/>
               </w:rPr>
-              <w:t>+1.68</w:t>
+              <w:t>-76.50</w:t>
             </w:r>
           </w:p>
         </w:tc>
@@ -1208,7 +1208,7 @@
                 <w:rFonts w:ascii="Arial" w:hAnsi="Arial"/>
                 <w:sz w:val="18"/>
               </w:rPr>
-              <w:t>+0.43</w:t>
+              <w:t>+38.31</w:t>
             </w:r>
           </w:p>
         </w:tc>
@@ -1266,7 +1266,7 @@
                 <w:rFonts w:ascii="Arial" w:hAnsi="Arial"/>
                 <w:sz w:val="18"/>
               </w:rPr>
-              <w:t>+0.26</w:t>
+              <w:t>+2.85</w:t>
             </w:r>
           </w:p>
         </w:tc>
@@ -1280,7 +1280,7 @@
                 <w:rFonts w:ascii="Arial" w:hAnsi="Arial"/>
                 <w:sz w:val="18"/>
               </w:rPr>
-              <w:t>+0.75</w:t>
+              <w:t>+10.16</w:t>
             </w:r>
           </w:p>
         </w:tc>
@@ -1338,7 +1338,7 @@
                 <w:rFonts w:ascii="Arial" w:hAnsi="Arial"/>
                 <w:sz w:val="18"/>
               </w:rPr>
-              <w:t>-0.15</w:t>
+              <w:t>+nan</w:t>
             </w:r>
           </w:p>
         </w:tc>
@@ -1352,7 +1352,7 @@
                 <w:rFonts w:ascii="Arial" w:hAnsi="Arial"/>
                 <w:sz w:val="18"/>
               </w:rPr>
-              <w:t>+1.24</w:t>
+              <w:t>+nan</w:t>
             </w:r>
           </w:p>
         </w:tc>
@@ -1410,7 +1410,7 @@
                 <w:rFonts w:ascii="Arial" w:hAnsi="Arial"/>
                 <w:sz w:val="18"/>
               </w:rPr>
-              <w:t>-0.81</w:t>
+              <w:t>-76.50</w:t>
             </w:r>
           </w:p>
         </w:tc>
@@ -1424,7 +1424,7 @@
                 <w:rFonts w:ascii="Arial" w:hAnsi="Arial"/>
                 <w:sz w:val="18"/>
               </w:rPr>
-              <w:t>+1.46</w:t>
+              <w:t>+38.31</w:t>
             </w:r>
           </w:p>
         </w:tc>
@@ -1482,7 +1482,7 @@
                 <w:rFonts w:ascii="Arial" w:hAnsi="Arial"/>
                 <w:sz w:val="18"/>
               </w:rPr>
-              <w:t>-1.52</w:t>
+              <w:t>+2.85</w:t>
             </w:r>
           </w:p>
         </w:tc>
@@ -1496,7 +1496,7 @@
                 <w:rFonts w:ascii="Arial" w:hAnsi="Arial"/>
                 <w:sz w:val="18"/>
               </w:rPr>
-              <w:t>+0.65</w:t>
+              <w:t>+10.16</w:t>
             </w:r>
           </w:p>
         </w:tc>
@@ -1554,7 +1554,7 @@
                 <w:rFonts w:ascii="Arial" w:hAnsi="Arial"/>
                 <w:sz w:val="18"/>
               </w:rPr>
-              <w:t>+0.21</w:t>
+              <w:t>+nan</w:t>
             </w:r>
           </w:p>
         </w:tc>
@@ -1568,7 +1568,7 @@
                 <w:rFonts w:ascii="Arial" w:hAnsi="Arial"/>
                 <w:sz w:val="18"/>
               </w:rPr>
-              <w:t>+0.46</w:t>
+              <w:t>+nan</w:t>
             </w:r>
           </w:p>
         </w:tc>

</xml_diff>